<commit_message>
Jeff's read-through corrections + book-wide em-dash purge
- Remove Nevada (never owned there; bad canon from the feedback doc)
- Fix Ryu: never "Rui Yu", and correct story order in Ch4/Ch14 (own
  property first, then partners, then managed our properties)
- Fix double bullets in the Ch2 Puck checklist (checkbox glyphs stacked
  on list bullets in DOCX)
- Honest owner-block caveat in the Ch5 manual comp method (can't tell
  blocks from bookings; counting several properties washes out the noise)
- Em-dashes: 150 -> 0 book-wide, each rewritten by hand (commas, colons,
  periods, parentheses); structural labels converted to colons; bonus
  docs swept too; chapter files re-synced byte-identical from assembly
- Internal canon (revision-tasks.md) updated so these never regress

Co-Authored-By: Claude Fable 5 <noreply@anthropic.com>
Claude-Session: https://claude.ai/code/session_015nzsXVPus1uW1psxXwQoWk
</commit_message>
<xml_diff>
--- a/book/Revision Log - Read This Alongside.docx
+++ b/book/Revision Log - Read This Alongside.docx
@@ -10,7 +10,7 @@
         <w:t xml:space="preserve">Revision Log ��� Read This Alongside</w:t>
       </w:r>
     </w:p>
-    <w:bookmarkStart w:id="44" w:name="X757b12ebfa7068a0ddad73c3b66fd3bcdd7dc7a"/>
+    <w:bookmarkStart w:id="45" w:name="X757b12ebfa7068a0ddad73c3b66fd3bcdd7dc7a"/>
     <w:p>
       <w:pPr>
         <w:pStyle w:val="Heading1"/>
@@ -2101,12 +2101,208 @@
       </w:r>
     </w:p>
     <w:bookmarkEnd w:id="42"/>
-    <w:bookmarkStart w:id="43" w:name="X26b902f5bea7889dac8b87fb6f0fd11ce39788e"/>
+    <w:bookmarkStart w:id="43" w:name="X00d4ab85363e57d72c30bd70499d751cc6a8408"/>
     <w:p>
       <w:pPr>
         <w:pStyle w:val="Heading2"/>
       </w:pPr>
       <w:r>
+        <w:t xml:space="preserve">July 24 corrections (your read-through notes)</w:t>
+      </w:r>
+    </w:p>
+    <w:p>
+      <w:pPr>
+        <w:numPr>
+          <w:ilvl w:val="0"/>
+          <w:numId w:val="1023"/>
+        </w:numPr>
+        <w:pStyle w:val="Compact"/>
+      </w:pPr>
+      <w:r>
+        <w:rPr>
+          <w:bCs/>
+          <w:b/>
+        </w:rPr>
+        <w:t xml:space="preserve">Nevada is gone.</w:t>
+      </w:r>
+      <w:r>
+        <w:t xml:space="preserve"> </w:t>
+      </w:r>
+      <w:r>
+        <w:t xml:space="preserve">You never owned there; the claim came from the feedback doc’s canon section and I should have flagged it. The time-stamp line now says</w:t>
+      </w:r>
+      <w:r>
+        <w:t xml:space="preserve"> </w:t>
+      </w:r>
+      <w:r>
+        <w:t xml:space="preserve">“</w:t>
+      </w:r>
+      <w:r>
+        <w:t xml:space="preserve">mostly in West Virginia.</w:t>
+      </w:r>
+      <w:r>
+        <w:t xml:space="preserve">”</w:t>
+      </w:r>
+    </w:p>
+    <w:p>
+      <w:pPr>
+        <w:numPr>
+          <w:ilvl w:val="0"/>
+          <w:numId w:val="1023"/>
+        </w:numPr>
+        <w:pStyle w:val="Compact"/>
+      </w:pPr>
+      <w:r>
+        <w:rPr>
+          <w:bCs/>
+          <w:b/>
+        </w:rPr>
+        <w:t xml:space="preserve">It’s Ryu, not</w:t>
+      </w:r>
+      <w:r>
+        <w:rPr>
+          <w:bCs/>
+          <w:b/>
+        </w:rPr>
+        <w:t xml:space="preserve"> </w:t>
+      </w:r>
+      <w:r>
+        <w:rPr>
+          <w:bCs/>
+          <w:b/>
+        </w:rPr>
+        <w:t xml:space="preserve">“</w:t>
+      </w:r>
+      <w:r>
+        <w:rPr>
+          <w:bCs/>
+          <w:b/>
+        </w:rPr>
+        <w:t xml:space="preserve">Rui Yu,</w:t>
+      </w:r>
+      <w:r>
+        <w:rPr>
+          <w:bCs/>
+          <w:b/>
+        </w:rPr>
+        <w:t xml:space="preserve">”</w:t>
+      </w:r>
+      <w:r>
+        <w:rPr>
+          <w:bCs/>
+          <w:b/>
+        </w:rPr>
+        <w:t xml:space="preserve"> </w:t>
+      </w:r>
+      <w:r>
+        <w:rPr>
+          <w:bCs/>
+          <w:b/>
+        </w:rPr>
+        <w:t xml:space="preserve">and the story order is fixed</w:t>
+      </w:r>
+      <w:r>
+        <w:t xml:space="preserve"> </w:t>
+      </w:r>
+      <w:r>
+        <w:t xml:space="preserve">in Chapters 4 and 14: he bought his own property first as one of your first students, then you became business partners, then he took over managing your properties and built out the team.</w:t>
+      </w:r>
+    </w:p>
+    <w:p>
+      <w:pPr>
+        <w:numPr>
+          <w:ilvl w:val="0"/>
+          <w:numId w:val="1023"/>
+        </w:numPr>
+        <w:pStyle w:val="Compact"/>
+      </w:pPr>
+      <w:r>
+        <w:rPr>
+          <w:bCs/>
+          <w:b/>
+        </w:rPr>
+        <w:t xml:space="preserve">The Puck checklist’s double bullets are fixed</w:t>
+      </w:r>
+      <w:r>
+        <w:t xml:space="preserve"> </w:t>
+      </w:r>
+      <w:r>
+        <w:t xml:space="preserve">(the checkbox glyphs were stacking on top of the list bullets in the DOCX; the printable version with real boxes lives in the Bonus Pack).</w:t>
+      </w:r>
+    </w:p>
+    <w:p>
+      <w:pPr>
+        <w:numPr>
+          <w:ilvl w:val="0"/>
+          <w:numId w:val="1023"/>
+        </w:numPr>
+        <w:pStyle w:val="Compact"/>
+      </w:pPr>
+      <w:r>
+        <w:rPr>
+          <w:bCs/>
+          <w:b/>
+        </w:rPr>
+        <w:t xml:space="preserve">The manual comp method is honest now</w:t>
+      </w:r>
+      <w:r>
+        <w:t xml:space="preserve">: instead of</w:t>
+      </w:r>
+      <w:r>
+        <w:t xml:space="preserve"> </w:t>
+      </w:r>
+      <w:r>
+        <w:t xml:space="preserve">“</w:t>
+      </w:r>
+      <w:r>
+        <w:t xml:space="preserve">watch for owner-blocked stretches</w:t>
+      </w:r>
+      <w:r>
+        <w:t xml:space="preserve">”</w:t>
+      </w:r>
+      <w:r>
+        <w:t xml:space="preserve"> </w:t>
+      </w:r>
+      <w:r>
+        <w:t xml:space="preserve">it says you can’t tell blocks from bookings from the outside, and counting several properties washes that noise out.</w:t>
+      </w:r>
+    </w:p>
+    <w:p>
+      <w:pPr>
+        <w:numPr>
+          <w:ilvl w:val="0"/>
+          <w:numId w:val="1023"/>
+        </w:numPr>
+        <w:pStyle w:val="Compact"/>
+      </w:pPr>
+      <w:r>
+        <w:rPr>
+          <w:bCs/>
+          <w:b/>
+        </w:rPr>
+        <w:t xml:space="preserve">Em-dashes: zero, book-wide.</w:t>
+      </w:r>
+      <w:r>
+        <w:t xml:space="preserve"> </w:t>
+      </w:r>
+      <w:r>
+        <w:t xml:space="preserve">All ~150 were rewritten by hand into commas, colons, periods, or parentheses that fit each sentence; structural labels (Part headings, the RURAL letters, tier names) became colons. The reader-facing Bonus Pack docs were swept too. If you ever want a handful back for punch, say so, but the default is now none.</w:t>
+      </w:r>
+    </w:p>
+    <w:p>
+      <w:r>
+        <w:pict>
+          <v:rect style="width:0;height:1.5pt" o:hralign="center" o:hrstd="t" o:hr="t"/>
+        </w:pict>
+      </w:r>
+    </w:p>
+    <w:bookmarkEnd w:id="43"/>
+    <w:bookmarkStart w:id="44" w:name="X26b902f5bea7889dac8b87fb6f0fd11ce39788e"/>
+    <w:p>
+      <w:pPr>
+        <w:pStyle w:val="Heading2"/>
+      </w:pPr>
+      <w:r>
         <w:t xml:space="preserve">Still waiting on you (nothing blocks reading the draft)</w:t>
       </w:r>
     </w:p>
@@ -2114,7 +2310,7 @@
       <w:pPr>
         <w:numPr>
           <w:ilvl w:val="0"/>
-          <w:numId w:val="1023"/>
+          <w:numId w:val="1024"/>
         </w:numPr>
         <w:pStyle w:val="Compact"/>
       </w:pPr>
@@ -2178,7 +2374,7 @@
       <w:pPr>
         <w:numPr>
           <w:ilvl w:val="0"/>
-          <w:numId w:val="1023"/>
+          <w:numId w:val="1024"/>
         </w:numPr>
         <w:pStyle w:val="Compact"/>
       </w:pPr>
@@ -2218,7 +2414,7 @@
       <w:pPr>
         <w:numPr>
           <w:ilvl w:val="0"/>
-          <w:numId w:val="1023"/>
+          <w:numId w:val="1024"/>
         </w:numPr>
         <w:pStyle w:val="Compact"/>
       </w:pPr>
@@ -2256,8 +2452,8 @@
         <w:t xml:space="preserve">and I’ll swap it in as the master and rebuild all three Amazon packages, the DOCX, the EPUBs, and the Bonus Pack cross-references so every deliverable matches.</w:t>
       </w:r>
     </w:p>
-    <w:bookmarkEnd w:id="43"/>
     <w:bookmarkEnd w:id="44"/>
+    <w:bookmarkEnd w:id="45"/>
     <w:sectPr/>
   </w:body>
 </w:document>
@@ -2622,6 +2818,9 @@
     </w:lvlOverride>
   </w:num>
   <w:num w:numId="1023">
+    <w:abstractNumId w:val="991"/>
+  </w:num>
+  <w:num w:numId="1024">
     <w:abstractNumId w:val="99411"/>
     <w:lvlOverride w:ilvl="0">
       <w:startOverride w:val="1"/>

</xml_diff>

<commit_message>
Add The Plain-English Glossary to back matter (Jeff's option 2)
34 one-line definitions of every piece of investor-speak in the book,
placed before the Framework Index; aligned with current doctrine
(18% Floor at moderate underwrite + survival check). Contents line and
the intro's How to Read This Book now point to it.

Co-Authored-By: Claude Fable 5 <noreply@anthropic.com>
Claude-Session: https://claude.ai/code/session_015nzsXVPus1uW1psxXwQoWk
</commit_message>
<xml_diff>
--- a/book/Revision Log - Read This Alongside.docx
+++ b/book/Revision Log - Read This Alongside.docx
@@ -10,7 +10,7 @@
         <w:t xml:space="preserve">Revision Log ��� Read This Alongside</w:t>
       </w:r>
     </w:p>
-    <w:bookmarkStart w:id="46" w:name="X757b12ebfa7068a0ddad73c3b66fd3bcdd7dc7a"/>
+    <w:bookmarkStart w:id="47" w:name="X757b12ebfa7068a0ddad73c3b66fd3bcdd7dc7a"/>
     <w:p>
       <w:pPr>
         <w:pStyle w:val="Heading1"/>
@@ -2610,12 +2610,119 @@
       </w:r>
     </w:p>
     <w:bookmarkEnd w:id="44"/>
-    <w:bookmarkStart w:id="45" w:name="X26b902f5bea7889dac8b87fb6f0fd11ce39788e"/>
+    <w:bookmarkStart w:id="45" w:name="X87c29b4ff9288e7ba3008ea7c12e51baa34a92b"/>
     <w:p>
       <w:pPr>
         <w:pStyle w:val="Heading2"/>
       </w:pPr>
       <w:r>
+        <w:t xml:space="preserve">July 31, later: The Plain-English Glossary (your call, option 2)</w:t>
+      </w:r>
+    </w:p>
+    <w:p>
+      <w:pPr>
+        <w:numPr>
+          <w:ilvl w:val="0"/>
+          <w:numId w:val="1025"/>
+        </w:numPr>
+        <w:pStyle w:val="Compact"/>
+      </w:pPr>
+      <w:r>
+        <w:t xml:space="preserve">Added</w:t>
+      </w:r>
+      <w:r>
+        <w:t xml:space="preserve"> </w:t>
+      </w:r>
+      <w:r>
+        <w:rPr>
+          <w:bCs/>
+          <w:b/>
+        </w:rPr>
+        <w:t xml:space="preserve">“</w:t>
+      </w:r>
+      <w:r>
+        <w:rPr>
+          <w:bCs/>
+          <w:b/>
+        </w:rPr>
+        <w:t xml:space="preserve">The Plain-English Glossary</w:t>
+      </w:r>
+      <w:r>
+        <w:rPr>
+          <w:bCs/>
+          <w:b/>
+        </w:rPr>
+        <w:t xml:space="preserve">”</w:t>
+      </w:r>
+      <w:r>
+        <w:t xml:space="preserve"> </w:t>
+      </w:r>
+      <w:r>
+        <w:t xml:space="preserve">to the book’s back matter, right before the Framework Index: 34 terms, one line each, written in your voice and aligned with current doctrine (the 18% Floor entry teaches moderate-underwrite-plus-survival-check;</w:t>
+      </w:r>
+      <w:r>
+        <w:t xml:space="preserve"> </w:t>
+      </w:r>
+      <w:r>
+        <w:t xml:space="preserve">“</w:t>
+      </w:r>
+      <w:r>
+        <w:t xml:space="preserve">cap rate</w:t>
+      </w:r>
+      <w:r>
+        <w:t xml:space="preserve">”</w:t>
+      </w:r>
+      <w:r>
+        <w:t xml:space="preserve"> </w:t>
+      </w:r>
+      <w:r>
+        <w:t xml:space="preserve">is honestly listed as deliberately unused). Every term still gets defined at first use in the chapters; the glossary is the flip-back rescue for readers who jump straight to Chapter 9 with keys in hand.</w:t>
+      </w:r>
+    </w:p>
+    <w:p>
+      <w:pPr>
+        <w:numPr>
+          <w:ilvl w:val="0"/>
+          <w:numId w:val="1025"/>
+        </w:numPr>
+        <w:pStyle w:val="Compact"/>
+      </w:pPr>
+      <w:r>
+        <w:t xml:space="preserve">The Contents line and the intro’s</w:t>
+      </w:r>
+      <w:r>
+        <w:t xml:space="preserve"> </w:t>
+      </w:r>
+      <w:r>
+        <w:t xml:space="preserve">“</w:t>
+      </w:r>
+      <w:r>
+        <w:t xml:space="preserve">How to Read This Book</w:t>
+      </w:r>
+      <w:r>
+        <w:t xml:space="preserve">”</w:t>
+      </w:r>
+      <w:r>
+        <w:t xml:space="preserve"> </w:t>
+      </w:r>
+      <w:r>
+        <w:t xml:space="preserve">now both point to it.</w:t>
+      </w:r>
+    </w:p>
+    <w:p>
+      <w:r>
+        <w:pict>
+          <v:rect style="width:0;height:1.5pt" o:hralign="center" o:hrstd="t" o:hr="t"/>
+        </w:pict>
+      </w:r>
+    </w:p>
+    <w:bookmarkEnd w:id="45"/>
+    <w:bookmarkStart w:id="46" w:name="X26b902f5bea7889dac8b87fb6f0fd11ce39788e"/>
+    <w:p>
+      <w:pPr>
+        <w:pStyle w:val="Heading2"/>
+      </w:pPr>
+      <w:r>
         <w:t xml:space="preserve">Still waiting on you (nothing blocks reading the draft)</w:t>
       </w:r>
     </w:p>
@@ -2623,7 +2730,7 @@
       <w:pPr>
         <w:numPr>
           <w:ilvl w:val="0"/>
-          <w:numId w:val="1025"/>
+          <w:numId w:val="1026"/>
         </w:numPr>
         <w:pStyle w:val="Compact"/>
       </w:pPr>
@@ -2687,7 +2794,7 @@
       <w:pPr>
         <w:numPr>
           <w:ilvl w:val="0"/>
-          <w:numId w:val="1025"/>
+          <w:numId w:val="1026"/>
         </w:numPr>
         <w:pStyle w:val="Compact"/>
       </w:pPr>
@@ -2727,7 +2834,7 @@
       <w:pPr>
         <w:numPr>
           <w:ilvl w:val="0"/>
-          <w:numId w:val="1025"/>
+          <w:numId w:val="1026"/>
         </w:numPr>
         <w:pStyle w:val="Compact"/>
       </w:pPr>
@@ -2765,8 +2872,8 @@
         <w:t xml:space="preserve">and I’ll swap it in as the master and rebuild all three Amazon packages, the DOCX, the EPUBs, and the Bonus Pack cross-references so every deliverable matches.</w:t>
       </w:r>
     </w:p>
-    <w:bookmarkEnd w:id="45"/>
     <w:bookmarkEnd w:id="46"/>
+    <w:bookmarkEnd w:id="47"/>
     <w:sectPr/>
   </w:body>
 </w:document>
@@ -3137,6 +3244,9 @@
     <w:abstractNumId w:val="991"/>
   </w:num>
   <w:num w:numId="1025">
+    <w:abstractNumId w:val="991"/>
+  </w:num>
+  <w:num w:numId="1026">
     <w:abstractNumId w:val="99411"/>
     <w:lvlOverride w:ilvl="0">
       <w:startOverride w:val="1"/>

</xml_diff>